<commit_message>
Update quy trình tiếp nhận đơn hàng
</commit_message>
<xml_diff>
--- a/02.FINAL_SPACE/FINAL_PROCESS/Tiếp nhận đơn hàng/Quy_trinh_tiep_nhan_don_hang.docx
+++ b/02.FINAL_SPACE/FINAL_PROCESS/Tiếp nhận đơn hàng/Quy_trinh_tiep_nhan_don_hang.docx
@@ -3322,7 +3322,7 @@
                 <w:color w:val="000000"/>
                 <w:sz w:val="19"/>
               </w:rPr>
-              <w:t>Biểu mẫu tạo đơn, dữ liệu OMS/API, thông báo, phiếu bàn giao và hồ sơ xử lý ngoại lệ</w:t>
+              <w:t>Bộ biểu mẫu nghiệp vụ BM-01 đến BM-04: tạo đơn, bổ sung, xác nhận và bàn giao</w:t>
             </w:r>
           </w:p>
         </w:tc>
@@ -7707,7 +7707,7 @@
                 <w:color w:val="000000"/>
                 <w:sz w:val="19"/>
               </w:rPr>
-              <w:t>QT-01</w:t>
+              <w:t>QT-VTP-TN-QL-01</w:t>
             </w:r>
           </w:p>
         </w:tc>
@@ -7857,7 +7857,7 @@
                 <w:color w:val="000000"/>
                 <w:sz w:val="19"/>
               </w:rPr>
-              <w:t>QT-02</w:t>
+              <w:t>QT-VTP-TN-QL-02</w:t>
             </w:r>
           </w:p>
         </w:tc>
@@ -8007,7 +8007,7 @@
                 <w:color w:val="000000"/>
                 <w:sz w:val="19"/>
               </w:rPr>
-              <w:t>QT-03</w:t>
+              <w:t>QT-VTP-TN-QL-03</w:t>
             </w:r>
           </w:p>
         </w:tc>
@@ -8157,7 +8157,7 @@
                 <w:color w:val="000000"/>
                 <w:sz w:val="19"/>
               </w:rPr>
-              <w:t>QT-04</w:t>
+              <w:t>QT-VTP-TN-QL-04</w:t>
             </w:r>
           </w:p>
         </w:tc>
@@ -8307,7 +8307,7 @@
                 <w:color w:val="000000"/>
                 <w:sz w:val="19"/>
               </w:rPr>
-              <w:t>QT-05</w:t>
+              <w:t>QT-VTP-TN-QL-05</w:t>
             </w:r>
           </w:p>
         </w:tc>
@@ -8457,7 +8457,7 @@
                 <w:color w:val="000000"/>
                 <w:sz w:val="19"/>
               </w:rPr>
-              <w:t>QT-06</w:t>
+              <w:t>QT-VTP-TN-QL-06</w:t>
             </w:r>
           </w:p>
         </w:tc>
@@ -8607,7 +8607,7 @@
                 <w:color w:val="000000"/>
                 <w:sz w:val="19"/>
               </w:rPr>
-              <w:t>QT-07</w:t>
+              <w:t>QT-VTP-TN-QL-07</w:t>
             </w:r>
           </w:p>
         </w:tc>
@@ -8757,7 +8757,7 @@
                 <w:color w:val="000000"/>
                 <w:sz w:val="19"/>
               </w:rPr>
-              <w:t>QT-08</w:t>
+              <w:t>QT-VTP-TN-QL-08</w:t>
             </w:r>
           </w:p>
         </w:tc>
@@ -8907,7 +8907,7 @@
                 <w:color w:val="000000"/>
                 <w:sz w:val="19"/>
               </w:rPr>
-              <w:t>QT-09</w:t>
+              <w:t>QT-VTP-TN-QL-09</w:t>
             </w:r>
           </w:p>
         </w:tc>
@@ -9057,7 +9057,7 @@
                 <w:color w:val="000000"/>
                 <w:sz w:val="19"/>
               </w:rPr>
-              <w:t>QT-10</w:t>
+              <w:t>QT-VTP-TN-QL-10</w:t>
             </w:r>
           </w:p>
         </w:tc>
@@ -9472,7 +9472,7 @@
                 <w:color w:val="000000"/>
                 <w:sz w:val="19"/>
               </w:rPr>
-              <w:t>QT-01</w:t>
+              <w:t>QT-VTP-TN-QL-01</w:t>
             </w:r>
           </w:p>
         </w:tc>
@@ -9709,7 +9709,7 @@
                 <w:color w:val="000000"/>
                 <w:sz w:val="19"/>
               </w:rPr>
-              <w:t>QT-02</w:t>
+              <w:t>QT-VTP-TN-QL-02</w:t>
             </w:r>
           </w:p>
         </w:tc>
@@ -9946,7 +9946,7 @@
                 <w:color w:val="000000"/>
                 <w:sz w:val="19"/>
               </w:rPr>
-              <w:t>QT-03</w:t>
+              <w:t>QT-VTP-TN-QL-03</w:t>
             </w:r>
           </w:p>
         </w:tc>
@@ -10183,7 +10183,7 @@
                 <w:color w:val="000000"/>
                 <w:sz w:val="19"/>
               </w:rPr>
-              <w:t>QT-04</w:t>
+              <w:t>QT-VTP-TN-QL-04</w:t>
             </w:r>
           </w:p>
         </w:tc>
@@ -10420,7 +10420,7 @@
                 <w:color w:val="000000"/>
                 <w:sz w:val="19"/>
               </w:rPr>
-              <w:t>QT-05</w:t>
+              <w:t>QT-VTP-TN-QL-05</w:t>
             </w:r>
           </w:p>
         </w:tc>
@@ -11870,7 +11870,7 @@
                 <w:color w:val="000000"/>
                 <w:sz w:val="19"/>
               </w:rPr>
-              <w:t>QN-01</w:t>
+              <w:t>QT-VTP-TN-QN-01</w:t>
             </w:r>
           </w:p>
         </w:tc>
@@ -12020,7 +12020,7 @@
                 <w:color w:val="000000"/>
                 <w:sz w:val="19"/>
               </w:rPr>
-              <w:t>QN-02</w:t>
+              <w:t>QT-VTP-TN-QN-02</w:t>
             </w:r>
           </w:p>
         </w:tc>
@@ -12170,7 +12170,7 @@
                 <w:color w:val="000000"/>
                 <w:sz w:val="19"/>
               </w:rPr>
-              <w:t>QN-03</w:t>
+              <w:t>QT-VTP-TN-QN-03</w:t>
             </w:r>
           </w:p>
         </w:tc>
@@ -12320,7 +12320,7 @@
                 <w:color w:val="000000"/>
                 <w:sz w:val="19"/>
               </w:rPr>
-              <w:t>QN-04</w:t>
+              <w:t>QT-VTP-TN-QN-04</w:t>
             </w:r>
           </w:p>
         </w:tc>
@@ -12470,7 +12470,7 @@
                 <w:color w:val="000000"/>
                 <w:sz w:val="19"/>
               </w:rPr>
-              <w:t>QN-05</w:t>
+              <w:t>QT-VTP-TN-QN-05</w:t>
             </w:r>
           </w:p>
         </w:tc>
@@ -12620,7 +12620,7 @@
                 <w:color w:val="000000"/>
                 <w:sz w:val="19"/>
               </w:rPr>
-              <w:t>QN-06</w:t>
+              <w:t>QT-VTP-TN-QN-06</w:t>
             </w:r>
           </w:p>
         </w:tc>
@@ -12770,7 +12770,7 @@
                 <w:color w:val="000000"/>
                 <w:sz w:val="19"/>
               </w:rPr>
-              <w:t>QN-07</w:t>
+              <w:t>QT-VTP-TN-QN-07</w:t>
             </w:r>
           </w:p>
         </w:tc>
@@ -12920,7 +12920,7 @@
                 <w:color w:val="000000"/>
                 <w:sz w:val="19"/>
               </w:rPr>
-              <w:t>QN-08</w:t>
+              <w:t>QT-VTP-TN-QN-08</w:t>
             </w:r>
           </w:p>
         </w:tc>
@@ -13070,7 +13070,7 @@
                 <w:color w:val="000000"/>
                 <w:sz w:val="19"/>
               </w:rPr>
-              <w:t>QN-09</w:t>
+              <w:t>QT-VTP-TN-QN-09</w:t>
             </w:r>
           </w:p>
         </w:tc>
@@ -13220,7 +13220,7 @@
                 <w:color w:val="000000"/>
                 <w:sz w:val="19"/>
               </w:rPr>
-              <w:t>QN-10</w:t>
+              <w:t>QT-VTP-TN-QN-10</w:t>
             </w:r>
           </w:p>
         </w:tc>
@@ -13635,7 +13635,7 @@
                 <w:color w:val="000000"/>
                 <w:sz w:val="19"/>
               </w:rPr>
-              <w:t>QN-01</w:t>
+              <w:t>QT-VTP-TN-QN-01</w:t>
             </w:r>
           </w:p>
         </w:tc>
@@ -13872,7 +13872,7 @@
                 <w:color w:val="000000"/>
                 <w:sz w:val="19"/>
               </w:rPr>
-              <w:t>QN-02</w:t>
+              <w:t>QT-VTP-TN-QN-02</w:t>
             </w:r>
           </w:p>
         </w:tc>
@@ -14109,7 +14109,7 @@
                 <w:color w:val="000000"/>
                 <w:sz w:val="19"/>
               </w:rPr>
-              <w:t>QN-03</w:t>
+              <w:t>QT-VTP-TN-QN-03</w:t>
             </w:r>
           </w:p>
         </w:tc>
@@ -14346,7 +14346,7 @@
                 <w:color w:val="000000"/>
                 <w:sz w:val="19"/>
               </w:rPr>
-              <w:t>QN-04</w:t>
+              <w:t>QT-VTP-TN-QN-04</w:t>
             </w:r>
           </w:p>
         </w:tc>
@@ -14583,7 +14583,7 @@
                 <w:color w:val="000000"/>
                 <w:sz w:val="19"/>
               </w:rPr>
-              <w:t>QN-05</w:t>
+              <w:t>QT-VTP-TN-QN-05</w:t>
             </w:r>
           </w:p>
         </w:tc>
@@ -23653,7 +23653,7 @@
                 <w:color w:val="000000"/>
                 <w:sz w:val="19"/>
               </w:rPr>
-              <w:t>CTRL-01</w:t>
+              <w:t>ISS-05</w:t>
             </w:r>
           </w:p>
         </w:tc>
@@ -24079,7 +24079,7 @@
                 <w:color w:val="000000"/>
                 <w:sz w:val="19"/>
               </w:rPr>
-              <w:t>ISS-01: Dữ liệu không hợp lệ; ISS-02: Rule giữa các kênh không đồng nhất; ISS-03: Tạo đơn hoặc tạo mã thất bại; ISS-04: Yêu cầu bỏ dở trong queue</w:t>
+              <w:t>ISS-01: Dữ liệu không hợp lệ; ISS-02: Rule giữa các kênh không đồng nhất; ISS-03: Tạo đơn hoặc tạo mã thất bại; ISS-04: Yêu cầu bỏ dở trong queue; ISS-05: PT/WT/CT và chất lượng chưa được đối soát cùng kỳ</w:t>
             </w:r>
           </w:p>
         </w:tc>
@@ -24142,7 +24142,7 @@
                 <w:color w:val="000000"/>
                 <w:sz w:val="19"/>
               </w:rPr>
-              <w:t>ISS-01: Khách hàng nhập sai / validation chưa rõ; ISS-02: Thiếu schema/version chung; ISS-03: Retry chưa idempotent; ISS-04: Thiếu SLA và timeout</w:t>
+              <w:t>ISS-01: Khách hàng nhập sai / validation chưa rõ; ISS-02: Thiếu schema/version chung; ISS-03: Retry chưa idempotent; ISS-04: Thiếu SLA và timeout; ISS-05: Nguồn dữ liệu phân tán theo kênh và trạng thái</w:t>
             </w:r>
           </w:p>
         </w:tc>
@@ -24205,7 +24205,7 @@
                 <w:color w:val="000000"/>
                 <w:sz w:val="19"/>
               </w:rPr>
-              <w:t>ISS-01: Rule kênh không đồng nhất; ISS-02: Thiếu mapping và owner; ISS-03: Thiếu error class và observability; ISS-04: Không có queue owner</w:t>
+              <w:t>ISS-01: Rule kênh không đồng nhất; ISS-02: Thiếu mapping và owner; ISS-03: Thiếu error class và observability; ISS-04: Không có queue owner; ISS-05: Thiếu định nghĩa chỉ số và điểm đo dùng chung</w:t>
             </w:r>
           </w:p>
         </w:tc>
@@ -24268,7 +24268,7 @@
                 <w:color w:val="000000"/>
                 <w:sz w:val="19"/>
               </w:rPr>
-              <w:t>ISS-01: Thiếu schema, owner và test; ISS-02: Thiếu mapping và owner; ISS-03: Thiếu error class và observability; ISS-04: Không có queue owner</w:t>
+              <w:t>ISS-01: Thiếu schema, owner và test; ISS-02: Thiếu mapping và owner; ISS-03: Thiếu error class và observability; ISS-04: Không có queue owner; ISS-05: Thiếu owner dữ liệu và quy tắc tổng hợp</w:t>
             </w:r>
           </w:p>
         </w:tc>
@@ -24331,7 +24331,7 @@
                 <w:color w:val="000000"/>
                 <w:sz w:val="19"/>
               </w:rPr>
-              <w:t>ISS-01: Chưa có quy tắc vận hành thống nhất; ISS-02: Thiếu contract test liên kênh; ISS-03: Chưa có replay chuẩn; ISS-04: Thiếu dashboard / escalation</w:t>
+              <w:t>ISS-01: Chưa có quy tắc vận hành thống nhất; ISS-02: Thiếu contract test liên kênh; ISS-03: Chưa có replay chuẩn; ISS-04: Thiếu dashboard / escalation; ISS-05: Chưa có bộ dữ liệu vận hành chuẩn để cập nhật định kỳ</w:t>
             </w:r>
           </w:p>
         </w:tc>
@@ -24394,11 +24394,15 @@
                 <w:color w:val="000000"/>
                 <w:sz w:val="19"/>
               </w:rPr>
-              <w:t>ISS-01: RC-01: Quy tắc vận hành dùng chung; ISS-02: RC-02: Hợp đồng dữ liệu và quy tắc thống nhất</w:t>
+              <w:t>ISS-01: RC-01: Quy tắc vận hành dùng chung</w:t>
+              <w:br/>
+              <w:t>ISS-02: RC-02: Hợp đồng dữ liệu và quy tắc thống nhất</w:t>
               <w:br/>
               <w:t>ISS-03: RC-03: Độ tin cậy và lịch sử giao dịch</w:t>
               <w:br/>
               <w:t>ISS-04: RC-04: Điều phối hàng đợi và thời hạn xử lý</w:t>
+              <w:br/>
+              <w:t>ISS-05: RC-05: Chuẩn hóa đo lường và dữ liệu vận hành</w:t>
             </w:r>
           </w:p>
         </w:tc>
@@ -24467,7 +24471,9 @@
               <w:br/>
               <w:t>3. Thiết lập người phụ trách hàng đợi, thời hạn và cảnh báo.</w:t>
               <w:br/>
-              <w:t>4. Tổng hợp lịch sử giao dịch, lịch sử lỗi và trạng thái hàng đợi theo cùng kỳ phân tích.</w:t>
+              <w:t>4. Chuẩn hóa định nghĩa PT, WT, CT, chất lượng và chi phí theo cùng kỳ phân tích.</w:t>
+              <w:br/>
+              <w:t>5. Gắn owner dữ liệu, điểm đo và lịch cập nhật cho toàn bộ kênh Web/App/API/Quầy.</w:t>
             </w:r>
           </w:p>
         </w:tc>

</xml_diff>

<commit_message>
Update 2 quy trình Tiếp nhận đơn và quản trị đối tác
</commit_message>
<xml_diff>
--- a/02.FINAL_SPACE/FINAL_PROCESS/Tiếp nhận đơn hàng/Quy_trinh_tiep_nhan_don_hang.docx
+++ b/02.FINAL_SPACE/FINAL_PROCESS/Tiếp nhận đơn hàng/Quy_trinh_tiep_nhan_don_hang.docx
@@ -248,7 +248,7 @@
                 <w:color w:val="000000"/>
                 <w:sz w:val="19"/>
               </w:rPr>
-              <w:t>Chủ trì: Kênh tiếp nhận/Nhân viên và Hệ thống OMS/API; phối hợp: Khách hàng/Đối tác và CSKH/Xử lý ngoại lệ; đầu ra phục vụ Bộ phận nhận hàng/Thu gom.</w:t>
+              <w:t>Chủ trì: Kênh tiếp nhận/Nhân viên và Hệ thống OMS/API; phối hợp: Khách hàng/Đối tác và CSKH/Xử lý ngoại lệ.</w:t>
             </w:r>
           </w:p>
         </w:tc>
@@ -374,9 +374,7 @@
                 <w:color w:val="000000"/>
                 <w:sz w:val="19"/>
               </w:rPr>
-              <w:t>Khách hàng/Đối tác nhận mã vận đơn;</w:t>
-              <w:br/>
-              <w:t>Bộ phận nhận hàng/Thu gom sử dụng mã để đối chiếu khi tiếp nhận bưu gửi vật lý.</w:t>
+              <w:t>Khách hàng/Đối tác cung cấp thông tin tạo đơn và nhận mã vận đơn cùng thông báo xác nhận.</w:t>
             </w:r>
           </w:p>
         </w:tc>
@@ -439,7 +437,7 @@
                 <w:color w:val="000000"/>
                 <w:sz w:val="19"/>
               </w:rPr>
-              <w:t>Tiếp nhận yêu cầu tạo đơn, kiểm tra và chuẩn hóa dữ liệu, ghi nhận đơn, tạo mã vận đơn và gửi xác nhận để chuyển sang bước nhận bưu gửi. Các số liệu trong Chương 4 được tính thống nhất theo bộ tham số và công thức của kỳ phân tích.</w:t>
+              <w:t>Tiếp nhận yêu cầu tạo đơn, kiểm tra và chuẩn hóa dữ liệu, ghi nhận đơn, tạo mã vận đơn và gửi xác nhận cho khách hàng/đối tác. Các số liệu trong Chương 4 được tính thống nhất theo bộ tham số và công thức của kỳ phân tích.</w:t>
             </w:r>
           </w:p>
         </w:tc>
@@ -1805,7 +1803,7 @@
                 <w:color w:val="000000"/>
                 <w:sz w:val="19"/>
               </w:rPr>
-              <w:t>Gửi mã vận đơn, dịch vụ, cước phí và trạng thái; chuyển sang nhận bưu gửi.</w:t>
+              <w:t>Gửi mã vận đơn, dịch vụ, cước phí và trạng thái cho khách hàng/đối tác.</w:t>
             </w:r>
           </w:p>
         </w:tc>
@@ -2117,7 +2115,7 @@
                 <w:color w:val="000000"/>
                 <w:sz w:val="19"/>
               </w:rPr>
-              <w:t>Đơn được chuyển sang nhận bưu gửi</w:t>
+              <w:t>Đơn đã có mã vận đơn</w:t>
             </w:r>
           </w:p>
         </w:tc>
@@ -2146,7 +2144,7 @@
                 <w:color w:val="000000"/>
                 <w:sz w:val="19"/>
               </w:rPr>
-              <w:t>Đơn đã có mã vận đơn và được chuyển sang bước nhận bưu gửi/khai thác tiếp theo.</w:t>
+              <w:t>Đơn được ghi nhận, tạo mã vận đơn và gửi xác nhận thành công cho khách hàng/đối tác.</w:t>
             </w:r>
           </w:p>
         </w:tc>
@@ -2809,7 +2807,7 @@
                 <w:color w:val="000000"/>
                 <w:sz w:val="19"/>
               </w:rPr>
-              <w:t>Xác định năm nhóm tác nhân tham gia tiếp nhận đơn và trách nhiệm tương ứng trên từng phân làn.</w:t>
+              <w:t>Xác định bốn nhóm tác nhân của quy trình tiếp nhận đơn và trách nhiệm tương ứng trên từng phân làn/participant.</w:t>
             </w:r>
           </w:p>
         </w:tc>
@@ -2959,7 +2957,7 @@
                 <w:color w:val="000000"/>
                 <w:sz w:val="19"/>
               </w:rPr>
-              <w:t>Xác định kênh tiếp nhận, thời điểm xử lý, đầu ra của từng bước và cách chuyển đơn sang nhận bưu gửi.</w:t>
+              <w:t>Xác định kênh tiếp nhận, thời điểm xử lý và đầu ra của từng bước trong phạm vi tiếp nhận đơn.</w:t>
             </w:r>
           </w:p>
         </w:tc>
@@ -3322,7 +3320,7 @@
                 <w:color w:val="000000"/>
                 <w:sz w:val="19"/>
               </w:rPr>
-              <w:t>Bộ biểu mẫu nghiệp vụ BM-01 đến BM-04: tạo đơn, bổ sung, xác nhận và bàn giao</w:t>
+              <w:t>Bộ biểu mẫu nghiệp vụ BM-01 đến BM-03: tạo đơn, bổ sung và xác nhận</w:t>
             </w:r>
           </w:p>
         </w:tc>
@@ -3380,7 +3378,7 @@
                 <w:color w:val="000000"/>
                 <w:sz w:val="19"/>
               </w:rPr>
-              <w:t>Kênh tiếp nhận, OMS/API, CSKH và bộ phận nhận hàng</w:t>
+              <w:t>Kênh tiếp nhận, OMS/API và CSKH</w:t>
             </w:r>
           </w:p>
         </w:tc>
@@ -3409,7 +3407,7 @@
                 <w:color w:val="000000"/>
                 <w:sz w:val="19"/>
               </w:rPr>
-              <w:t>Theo dõi dữ liệu đầu vào, trạng thái xử lý, mã vận đơn, kết quả xác nhận và thông tin chuyển tiếp sang công đoạn sau.</w:t>
+              <w:t>Theo dõi dữ liệu đầu vào, trạng thái xử lý, mã vận đơn và kết quả xác nhận trong phạm vi quy trình.</w:t>
             </w:r>
           </w:p>
         </w:tc>
@@ -6607,7 +6605,7 @@
           <w:color w:val="000000"/>
           <w:sz w:val="24"/>
         </w:rPr>
-        <w:t>Trong quá trình vận hành quy trình tiếp nhận đơn hàng, hệ thống biểu mẫu nghiệp vụ là phương tiện thu thập thông tin, kiểm soát dữ liệu và chuyển giao kết quả giữa các bên. Danh mục biểu mẫu gồm yêu cầu tạo đơn, phiếu hoặc dữ liệu bổ sung, thông báo lỗi, thông báo xác nhận và thông tin bàn giao mã vận đơn; mục đích sử dụng của từng loại được trình bày thống nhất theo các bước tác nghiệp tại Bảng 1.2 và Bảng 2.1.</w:t>
+        <w:t>Trong quá trình vận hành quy trình tiếp nhận đơn hàng, hệ thống biểu mẫu nghiệp vụ là phương tiện thu thập thông tin, kiểm soát dữ liệu và trả kết quả cho các bên trong phạm vi quy trình. Danh mục biểu mẫu gồm yêu cầu tạo đơn, phiếu hoặc dữ liệu bổ sung, thông báo lỗi và thông báo xác nhận; mục đích sử dụng của từng loại được trình bày thống nhất theo các bước tác nghiệp tại Bảng 1.2 và Bảng 2.1.</w:t>
       </w:r>
     </w:p>
     <w:p>
@@ -6639,7 +6637,7 @@
           <w:color w:val="000000"/>
           <w:sz w:val="24"/>
         </w:rPr>
-        <w:t>Theo phương pháp luận khai phá quy trình của Dumas et al. (2018, Chương 5), phỏng vấn là công cụ nền tảng để thu thập tri thức nghiệp vụ, nhận diện quy tắc xử lý ngầm định, trường hợp ngoại lệ và các sự cố không thể hiện đầy đủ trong tài liệu tĩnh. Nội dung phỏng vấn được xây dựng theo ma trận năm nhóm tác nhân gồm Khách hàng/Đối tác, Kênh tiếp nhận/Nhân viên, Hệ thống OMS/API, CSKH/Xử lý ngoại lệ và Bộ phận nhận hàng/Thu gom; Bảng 2.3 thể hiện đối chiếu 1:1 giữa tác nhân, phân làn BPMN và chức danh tham gia trao đổi.</w:t>
+        <w:t>Theo phương pháp luận khai phá quy trình của Dumas et al. (2018, Chương 5), phỏng vấn là công cụ nền tảng để thu thập tri thức nghiệp vụ, nhận diện quy tắc xử lý ngầm định, trường hợp ngoại lệ và các sự cố không thể hiện đầy đủ trong tài liệu tĩnh. Nội dung phỏng vấn được xây dựng theo ma trận bốn tác nhân gồm Khách hàng/Đối tác, Kênh tiếp nhận/Nhân viên, Hệ thống OMS/API và CSKH/Xử lý ngoại lệ; Bảng 2.3 thể hiện đối chiếu 1:1 giữa tác nhân, participant/lane BPMN và chức danh tham gia trao đổi.</w:t>
       </w:r>
     </w:p>
     <w:p>
@@ -7295,127 +7293,6 @@
           </w:p>
         </w:tc>
       </w:tr>
-      <w:tr>
-        <w:trPr>
-          <w:cantSplit/>
-        </w:trPr>
-        <w:tc>
-          <w:tcPr>
-            <w:tcW w:type="dxa" w:w="2268"/>
-            <w:vAlign w:val="center"/>
-            <w:tcMar>
-              <w:top w:w="80" w:type="dxa"/>
-              <w:bottom w:w="80" w:type="dxa"/>
-              <w:left w:w="120" w:type="dxa"/>
-              <w:right w:w="120" w:type="dxa"/>
-            </w:tcMar>
-            <w:shd w:fill="FFFFFF"/>
-          </w:tcPr>
-          <w:p>
-            <w:pPr>
-              <w:spacing w:before="20" w:after="20" w:line="276" w:lineRule="auto"/>
-              <w:jc w:val="center"/>
-            </w:pPr>
-            <w:r>
-              <w:rPr>
-                <w:rFonts w:ascii="Times New Roman" w:hAnsi="Times New Roman"/>
-                <w:b w:val="0"/>
-                <w:i w:val="0"/>
-                <w:color w:val="000000"/>
-                <w:sz w:val="19"/>
-              </w:rPr>
-              <w:t>5</w:t>
-            </w:r>
-          </w:p>
-        </w:tc>
-        <w:tc>
-          <w:tcPr>
-            <w:tcW w:type="dxa" w:w="2268"/>
-            <w:vAlign w:val="center"/>
-            <w:tcMar>
-              <w:top w:w="80" w:type="dxa"/>
-              <w:bottom w:w="80" w:type="dxa"/>
-              <w:left w:w="120" w:type="dxa"/>
-              <w:right w:w="120" w:type="dxa"/>
-            </w:tcMar>
-            <w:shd w:fill="FFFFFF"/>
-          </w:tcPr>
-          <w:p>
-            <w:pPr>
-              <w:spacing w:before="20" w:after="20" w:line="276" w:lineRule="auto"/>
-              <w:jc w:val="left"/>
-            </w:pPr>
-            <w:r>
-              <w:rPr>
-                <w:rFonts w:ascii="Times New Roman" w:hAnsi="Times New Roman"/>
-                <w:b w:val="0"/>
-                <w:i w:val="0"/>
-                <w:color w:val="000000"/>
-                <w:sz w:val="19"/>
-              </w:rPr>
-              <w:t>Bộ phận nhận hàng / Thu gom</w:t>
-            </w:r>
-          </w:p>
-        </w:tc>
-        <w:tc>
-          <w:tcPr>
-            <w:tcW w:type="dxa" w:w="2268"/>
-            <w:vAlign w:val="center"/>
-            <w:tcMar>
-              <w:top w:w="80" w:type="dxa"/>
-              <w:bottom w:w="80" w:type="dxa"/>
-              <w:left w:w="120" w:type="dxa"/>
-              <w:right w:w="120" w:type="dxa"/>
-            </w:tcMar>
-            <w:shd w:fill="FFFFFF"/>
-          </w:tcPr>
-          <w:p>
-            <w:pPr>
-              <w:spacing w:before="20" w:after="20" w:line="276" w:lineRule="auto"/>
-              <w:jc w:val="left"/>
-            </w:pPr>
-            <w:r>
-              <w:rPr>
-                <w:rFonts w:ascii="Times New Roman" w:hAnsi="Times New Roman"/>
-                <w:b w:val="0"/>
-                <w:i w:val="0"/>
-                <w:color w:val="000000"/>
-                <w:sz w:val="19"/>
-              </w:rPr>
-              <w:t>Khách hàng nội bộ</w:t>
-            </w:r>
-          </w:p>
-        </w:tc>
-        <w:tc>
-          <w:tcPr>
-            <w:tcW w:type="dxa" w:w="2268"/>
-            <w:vAlign w:val="center"/>
-            <w:tcMar>
-              <w:top w:w="80" w:type="dxa"/>
-              <w:bottom w:w="80" w:type="dxa"/>
-              <w:left w:w="120" w:type="dxa"/>
-              <w:right w:w="120" w:type="dxa"/>
-            </w:tcMar>
-            <w:shd w:fill="FFFFFF"/>
-          </w:tcPr>
-          <w:p>
-            <w:pPr>
-              <w:spacing w:before="20" w:after="20" w:line="276" w:lineRule="auto"/>
-              <w:jc w:val="left"/>
-            </w:pPr>
-            <w:r>
-              <w:rPr>
-                <w:rFonts w:ascii="Times New Roman" w:hAnsi="Times New Roman"/>
-                <w:b w:val="0"/>
-                <w:i w:val="0"/>
-                <w:color w:val="000000"/>
-                <w:sz w:val="19"/>
-              </w:rPr>
-              <w:t>Nhân viên nhận hàng</w:t>
-            </w:r>
-          </w:p>
-        </w:tc>
-      </w:tr>
     </w:tbl>
     <w:p>
       <w:pPr>
@@ -7446,7 +7323,7 @@
           <w:color w:val="000000"/>
           <w:sz w:val="24"/>
         </w:rPr>
-        <w:t>Phương pháp phỏng vấn định tính được thiết kế theo cấu trúc hai tầng gồm 10 câu hỏi có cấu trúc và 10 câu hỏi mở, tập trung vào điều kiện tạo đơn, trường dữ liệu bắt buộc, cách xử lý lỗi, vòng bổ sung, bàn giao mã vận đơn và các điểm nghẽn trong trải nghiệm khách hàng.</w:t>
+        <w:t>Phương pháp phỏng vấn định tính được thiết kế theo cấu trúc hai tầng gồm 10 câu hỏi có cấu trúc và 10 câu hỏi mở, tập trung vào điều kiện tạo đơn, trường dữ liệu bắt buộc, cách xử lý lỗi, vòng bổ sung, điều kiện hoàn tất và các điểm nghẽn trong trải nghiệm khách hàng.</w:t>
       </w:r>
     </w:p>
     <w:p>
@@ -8336,7 +8213,7 @@
                 <w:color w:val="000000"/>
                 <w:sz w:val="19"/>
               </w:rPr>
-              <w:t>Trạng thái nào chuyển đơn sang nhận bưu gửi?</w:t>
+              <w:t>Trạng thái nào xác nhận việc tạo đơn đã hoàn tất?</w:t>
             </w:r>
           </w:p>
         </w:tc>
@@ -8365,7 +8242,7 @@
                 <w:color w:val="000000"/>
                 <w:sz w:val="19"/>
               </w:rPr>
-              <w:t>OMS / Thu gom</w:t>
+              <w:t>OMS / Kênh / CSKH</w:t>
             </w:r>
           </w:p>
         </w:tc>
@@ -8394,7 +8271,7 @@
                 <w:color w:val="000000"/>
                 <w:sz w:val="19"/>
               </w:rPr>
-              <w:t>Xác nhận output contract và handoff.</w:t>
+              <w:t>Xác nhận điều kiện kết thúc và nội dung thông báo cho khách hàng/đối tác.</w:t>
             </w:r>
           </w:p>
         </w:tc>
@@ -10449,7 +10326,7 @@
                 <w:color w:val="000000"/>
                 <w:sz w:val="19"/>
               </w:rPr>
-              <w:t>Chuyển thủ công</w:t>
+              <w:t>Xác nhận thủ công</w:t>
             </w:r>
           </w:p>
         </w:tc>
@@ -10478,7 +10355,7 @@
                 <w:color w:val="000000"/>
                 <w:sz w:val="19"/>
               </w:rPr>
-              <w:t>Chuyển tự động</w:t>
+              <w:t>Xác nhận tự động</w:t>
             </w:r>
           </w:p>
         </w:tc>
@@ -10507,7 +10384,7 @@
                 <w:color w:val="000000"/>
                 <w:sz w:val="19"/>
               </w:rPr>
-              <w:t>Chuyển theo trạng thái đã xác nhận</w:t>
+              <w:t>Kết hợp trạng thái và thông báo xác nhận</w:t>
             </w:r>
           </w:p>
         </w:tc>
@@ -10536,7 +10413,7 @@
                 <w:color w:val="000000"/>
                 <w:sz w:val="19"/>
               </w:rPr>
-              <w:t>Đơn có mã và trạng thái xác nhận được chuyển sang nhận bưu gửi.</w:t>
+              <w:t>Đơn có mã và trạng thái xác nhận được gửi cho khách hàng/đối tác.</w:t>
             </w:r>
           </w:p>
         </w:tc>
@@ -10565,7 +10442,7 @@
                 <w:color w:val="000000"/>
                 <w:sz w:val="19"/>
               </w:rPr>
-              <w:t>Trạng thái rõ ràng làm giảm khoảng trống bàn giao.</w:t>
+              <w:t>Trạng thái rõ ràng giúp kết thúc quy trình nhất quán.</w:t>
             </w:r>
           </w:p>
         </w:tc>
@@ -10594,7 +10471,7 @@
                 <w:color w:val="000000"/>
                 <w:sz w:val="19"/>
               </w:rPr>
-              <w:t>Tên trạng thái, thời điểm chuyển và đơn vị nhận.</w:t>
+              <w:t>Tên trạng thái, thời điểm hoàn tất và nội dung thông báo.</w:t>
             </w:r>
           </w:p>
         </w:tc>
@@ -10623,7 +10500,7 @@
                 <w:color w:val="000000"/>
                 <w:sz w:val="19"/>
               </w:rPr>
-              <w:t>Thông báo xác nhận và dữ liệu bàn giao.</w:t>
+              <w:t>Thông báo xác nhận và transaction log.</w:t>
             </w:r>
           </w:p>
         </w:tc>
@@ -22328,185 +22205,6 @@
                 <w:sz w:val="19"/>
               </w:rPr>
               <w:t>Tăng chi phí hỗ trợ, WT và tỷ lệ xử lý lại.</w:t>
-            </w:r>
-          </w:p>
-        </w:tc>
-      </w:tr>
-      <w:tr>
-        <w:trPr>
-          <w:cantSplit/>
-        </w:trPr>
-        <w:tc>
-          <w:tcPr>
-            <w:tcW w:type="dxa" w:w="1512"/>
-            <w:vAlign w:val="center"/>
-            <w:tcMar>
-              <w:top w:w="80" w:type="dxa"/>
-              <w:bottom w:w="80" w:type="dxa"/>
-              <w:left w:w="120" w:type="dxa"/>
-              <w:right w:w="120" w:type="dxa"/>
-            </w:tcMar>
-            <w:shd w:fill="FFFFFF"/>
-          </w:tcPr>
-          <w:p>
-            <w:pPr>
-              <w:spacing w:before="20" w:after="20" w:line="276" w:lineRule="auto"/>
-              <w:jc w:val="left"/>
-            </w:pPr>
-            <w:r>
-              <w:rPr>
-                <w:rFonts w:ascii="Times New Roman" w:hAnsi="Times New Roman"/>
-                <w:b w:val="0"/>
-                <w:i w:val="0"/>
-                <w:color w:val="000000"/>
-                <w:sz w:val="19"/>
-              </w:rPr>
-              <w:t>Bộ phận nhận hàng / Thu gom</w:t>
-            </w:r>
-          </w:p>
-        </w:tc>
-        <w:tc>
-          <w:tcPr>
-            <w:tcW w:type="dxa" w:w="1512"/>
-            <w:vAlign w:val="center"/>
-            <w:tcMar>
-              <w:top w:w="80" w:type="dxa"/>
-              <w:bottom w:w="80" w:type="dxa"/>
-              <w:left w:w="120" w:type="dxa"/>
-              <w:right w:w="120" w:type="dxa"/>
-            </w:tcMar>
-            <w:shd w:fill="FFFFFF"/>
-          </w:tcPr>
-          <w:p>
-            <w:pPr>
-              <w:spacing w:before="20" w:after="20" w:line="276" w:lineRule="auto"/>
-              <w:jc w:val="left"/>
-            </w:pPr>
-            <w:r>
-              <w:rPr>
-                <w:rFonts w:ascii="Times New Roman" w:hAnsi="Times New Roman"/>
-                <w:b w:val="0"/>
-                <w:i w:val="0"/>
-                <w:color w:val="000000"/>
-                <w:sz w:val="19"/>
-              </w:rPr>
-              <w:t>Tiếp nhận mã vận đơn và chuẩn bị nhận bưu gửi.</w:t>
-            </w:r>
-          </w:p>
-        </w:tc>
-        <w:tc>
-          <w:tcPr>
-            <w:tcW w:type="dxa" w:w="1512"/>
-            <w:vAlign w:val="center"/>
-            <w:tcMar>
-              <w:top w:w="80" w:type="dxa"/>
-              <w:bottom w:w="80" w:type="dxa"/>
-              <w:left w:w="120" w:type="dxa"/>
-              <w:right w:w="120" w:type="dxa"/>
-            </w:tcMar>
-            <w:shd w:fill="FFFFFF"/>
-          </w:tcPr>
-          <w:p>
-            <w:pPr>
-              <w:spacing w:before="20" w:after="20" w:line="276" w:lineRule="auto"/>
-              <w:jc w:val="left"/>
-            </w:pPr>
-            <w:r>
-              <w:rPr>
-                <w:rFonts w:ascii="Times New Roman" w:hAnsi="Times New Roman"/>
-                <w:b w:val="0"/>
-                <w:i w:val="0"/>
-                <w:color w:val="000000"/>
-                <w:sz w:val="19"/>
-              </w:rPr>
-              <w:t>Mã và trạng thái bàn giao chính xác.</w:t>
-            </w:r>
-          </w:p>
-        </w:tc>
-        <w:tc>
-          <w:tcPr>
-            <w:tcW w:type="dxa" w:w="1512"/>
-            <w:vAlign w:val="center"/>
-            <w:tcMar>
-              <w:top w:w="80" w:type="dxa"/>
-              <w:bottom w:w="80" w:type="dxa"/>
-              <w:left w:w="120" w:type="dxa"/>
-              <w:right w:w="120" w:type="dxa"/>
-            </w:tcMar>
-            <w:shd w:fill="FFFFFF"/>
-          </w:tcPr>
-          <w:p>
-            <w:pPr>
-              <w:spacing w:before="20" w:after="20" w:line="276" w:lineRule="auto"/>
-              <w:jc w:val="left"/>
-            </w:pPr>
-            <w:r>
-              <w:rPr>
-                <w:rFonts w:ascii="Times New Roman" w:hAnsi="Times New Roman"/>
-                <w:b w:val="0"/>
-                <w:i w:val="0"/>
-                <w:color w:val="000000"/>
-                <w:sz w:val="19"/>
-              </w:rPr>
-              <w:t>Trạng thái chưa đồng bộ có thể gây chậm nhận hàng hoặc đối chiếu sai.</w:t>
-            </w:r>
-          </w:p>
-        </w:tc>
-        <w:tc>
-          <w:tcPr>
-            <w:tcW w:type="dxa" w:w="1512"/>
-            <w:vAlign w:val="center"/>
-            <w:tcMar>
-              <w:top w:w="80" w:type="dxa"/>
-              <w:bottom w:w="80" w:type="dxa"/>
-              <w:left w:w="120" w:type="dxa"/>
-              <w:right w:w="120" w:type="dxa"/>
-            </w:tcMar>
-            <w:shd w:fill="FFFFFF"/>
-          </w:tcPr>
-          <w:p>
-            <w:pPr>
-              <w:spacing w:before="20" w:after="20" w:line="276" w:lineRule="auto"/>
-              <w:jc w:val="left"/>
-            </w:pPr>
-            <w:r>
-              <w:rPr>
-                <w:rFonts w:ascii="Times New Roman" w:hAnsi="Times New Roman"/>
-                <w:b w:val="0"/>
-                <w:i w:val="0"/>
-                <w:color w:val="000000"/>
-                <w:sz w:val="19"/>
-              </w:rPr>
-              <w:t>Đơn đã có mã và xác nhận được chuyển sang công đoạn nhận bưu gửi.</w:t>
-            </w:r>
-          </w:p>
-        </w:tc>
-        <w:tc>
-          <w:tcPr>
-            <w:tcW w:type="dxa" w:w="1512"/>
-            <w:vAlign w:val="center"/>
-            <w:tcMar>
-              <w:top w:w="80" w:type="dxa"/>
-              <w:bottom w:w="80" w:type="dxa"/>
-              <w:left w:w="120" w:type="dxa"/>
-              <w:right w:w="120" w:type="dxa"/>
-            </w:tcMar>
-            <w:shd w:fill="FFFFFF"/>
-          </w:tcPr>
-          <w:p>
-            <w:pPr>
-              <w:spacing w:before="20" w:after="20" w:line="276" w:lineRule="auto"/>
-              <w:jc w:val="left"/>
-            </w:pPr>
-            <w:r>
-              <w:rPr>
-                <w:rFonts w:ascii="Times New Roman" w:hAnsi="Times New Roman"/>
-                <w:b w:val="0"/>
-                <w:i w:val="0"/>
-                <w:color w:val="000000"/>
-                <w:sz w:val="19"/>
-              </w:rPr>
-              <w:t>Ảnh hưởng đến tính liên tục giữa tiếp nhận đơn và khai thác bưu gửi.</w:t>
             </w:r>
           </w:p>
         </w:tc>

</xml_diff>